<commit_message>
DIW - UT5 AE_01
</commit_message>
<xml_diff>
--- a/DIW/UT5/Ejercicios/Actividad Evaluativa 1/González_García_Pablo_TEMA_05_AE_01.docx
+++ b/DIW/UT5/Ejercicios/Actividad Evaluativa 1/González_García_Pablo_TEMA_05_AE_01.docx
@@ -22,255 +22,477 @@
     </w:p>
     <w:p>
       <w:r>
-        <w:t xml:space="preserve">En esta actividad se evalúa la accesibilidad de la web utilizada en la primera actividad (Starbucks). Se han realizado tres tareas: comprobación de contraste con </w:t>
-      </w:r>
-      <w:proofErr w:type="spellStart"/>
-      <w:r>
-        <w:t>Contrast</w:t>
-      </w:r>
-      <w:proofErr w:type="spellEnd"/>
+        <w:t>En esta actividad se evalúa la accesibilidad de la web utilizada en la primera actividad (Starbucks). Se han realizado tres tareas: comprobación de contraste con Contrast Checker, visualización del sitio en modo texto mediante Textise y evaluación con Accessibility Checker. Además, se proponen soluciones y mejoras para alcanzar los niveles de conformidad WCAG recomendados.</w:t>
+      </w:r>
+    </w:p>
+    <w:p>
+      <w:pPr>
+        <w:rPr>
+          <w:b/>
+          <w:bCs/>
+        </w:rPr>
+      </w:pPr>
+      <w:r>
+        <w:rPr>
+          <w:b/>
+          <w:bCs/>
+        </w:rPr>
+        <w:t>_____________________________________________________________________________</w:t>
+      </w:r>
+    </w:p>
+    <w:p>
+      <w:pPr>
+        <w:rPr>
+          <w:b/>
+          <w:bCs/>
+        </w:rPr>
+      </w:pPr>
+      <w:r>
+        <w:rPr>
+          <w:b/>
+          <w:bCs/>
+        </w:rPr>
+        <w:t>TAREA 1 — Contraste de colores (Contrast Checker)</w:t>
+      </w:r>
+    </w:p>
+    <w:p>
+      <w:pPr>
+        <w:rPr>
+          <w:b/>
+          <w:bCs/>
+        </w:rPr>
+      </w:pPr>
+      <w:r>
+        <w:rPr>
+          <w:b/>
+          <w:bCs/>
+        </w:rPr>
+        <w:t>1.1. Paleta tomada (valores usados)</w:t>
+      </w:r>
+    </w:p>
+    <w:p>
+      <w:pPr>
+        <w:numPr>
+          <w:ilvl w:val="0"/>
+          <w:numId w:val="1"/>
+        </w:numPr>
+      </w:pPr>
+      <w:r>
+        <w:t>Verde principal: #006241</w:t>
+      </w:r>
+    </w:p>
+    <w:p>
+      <w:pPr>
+        <w:numPr>
+          <w:ilvl w:val="0"/>
+          <w:numId w:val="1"/>
+        </w:numPr>
+      </w:pPr>
+      <w:r>
+        <w:t>Verde secundario: #00754A</w:t>
+      </w:r>
+    </w:p>
+    <w:p>
+      <w:pPr>
+        <w:numPr>
+          <w:ilvl w:val="0"/>
+          <w:numId w:val="1"/>
+        </w:numPr>
+      </w:pPr>
+      <w:r>
+        <w:t>Neutro cálido: #F2F0EB</w:t>
+      </w:r>
+    </w:p>
+    <w:p>
+      <w:pPr>
+        <w:numPr>
+          <w:ilvl w:val="0"/>
+          <w:numId w:val="1"/>
+        </w:numPr>
+      </w:pPr>
+      <w:r>
+        <w:t>Blanco: #FFFFFF</w:t>
+      </w:r>
+    </w:p>
+    <w:p>
+      <w:pPr>
+        <w:numPr>
+          <w:ilvl w:val="0"/>
+          <w:numId w:val="1"/>
+        </w:numPr>
+      </w:pPr>
+      <w:r>
+        <w:t>Negro carbón: #111111</w:t>
+      </w:r>
+    </w:p>
+    <w:p>
+      <w:pPr>
+        <w:numPr>
+          <w:ilvl w:val="0"/>
+          <w:numId w:val="1"/>
+        </w:numPr>
+      </w:pPr>
+      <w:r>
+        <w:t>(También incluyo colores de acento del proyecto Hard Enduro por comparación: Rojo #D72638, Naranja #FF6B00)</w:t>
+      </w:r>
+    </w:p>
+    <w:p>
+      <w:r>
+        <w:t xml:space="preserve">He comprobado las combinaciones principales y calculado la </w:t>
+      </w:r>
+      <w:r>
+        <w:rPr>
+          <w:b/>
+          <w:bCs/>
+        </w:rPr>
+        <w:t>ratio de contraste</w:t>
+      </w:r>
+      <w:r>
+        <w:t xml:space="preserve"> (WCAG) entre los pares relevantes.</w:t>
+      </w:r>
+    </w:p>
+    <w:p>
+      <w:pPr>
+        <w:rPr>
+          <w:b/>
+          <w:bCs/>
+        </w:rPr>
+      </w:pPr>
+      <w:r>
+        <w:rPr>
+          <w:b/>
+          <w:bCs/>
+        </w:rPr>
+        <w:t>1.2. Resultados (contrast ratio calculada)</w:t>
+      </w:r>
+    </w:p>
+    <w:p>
+      <w:r>
+        <w:t>(Valores calculados con la fórmula WCAG 2.0; redondeados a 2 decimales)</w:t>
+      </w:r>
+    </w:p>
+    <w:p>
+      <w:pPr>
+        <w:numPr>
+          <w:ilvl w:val="0"/>
+          <w:numId w:val="2"/>
+        </w:numPr>
+      </w:pPr>
+      <w:r>
+        <w:t xml:space="preserve">#006241 sobre #FFFFFF → </w:t>
+      </w:r>
+      <w:r>
+        <w:rPr>
+          <w:b/>
+          <w:bCs/>
+        </w:rPr>
+        <w:t>7.4</w:t>
+      </w:r>
+      <w:r>
+        <w:rPr>
+          <w:b/>
+          <w:bCs/>
+        </w:rPr>
+        <w:t>3</w:t>
+      </w:r>
+      <w:r>
+        <w:rPr>
+          <w:b/>
+          <w:bCs/>
+        </w:rPr>
+        <w:t xml:space="preserve"> : 1</w:t>
+      </w:r>
+      <w:r>
+        <w:t xml:space="preserve"> → </w:t>
+      </w:r>
+      <w:r>
+        <w:rPr>
+          <w:b/>
+          <w:bCs/>
+        </w:rPr>
+        <w:t>Cumple AA y AAA</w:t>
+      </w:r>
+      <w:r>
+        <w:t xml:space="preserve"> (texto normal y grande).</w:t>
+      </w:r>
+    </w:p>
+    <w:p>
+      <w:pPr>
+        <w:ind w:left="720"/>
+      </w:pPr>
+      <w:r>
+        <w:rPr>
+          <w:noProof/>
+        </w:rPr>
+        <w:lastRenderedPageBreak/>
+        <w:drawing>
+          <wp:inline distT="0" distB="0" distL="0" distR="0" wp14:anchorId="40387763" wp14:editId="640F3320">
+            <wp:extent cx="5400040" cy="6067425"/>
+            <wp:effectExtent l="0" t="0" r="0" b="9525"/>
+            <wp:docPr id="272167855" name="Imagen 1" descr="Interfaz de usuario gráfica, Texto&#10;&#10;El contenido generado por IA puede ser incorrecto."/>
+            <wp:cNvGraphicFramePr>
+              <a:graphicFrameLocks xmlns:a="http://schemas.openxmlformats.org/drawingml/2006/main" noChangeAspect="1"/>
+            </wp:cNvGraphicFramePr>
+            <a:graphic xmlns:a="http://schemas.openxmlformats.org/drawingml/2006/main">
+              <a:graphicData uri="http://schemas.openxmlformats.org/drawingml/2006/picture">
+                <pic:pic xmlns:pic="http://schemas.openxmlformats.org/drawingml/2006/picture">
+                  <pic:nvPicPr>
+                    <pic:cNvPr id="272167855" name="Imagen 1" descr="Interfaz de usuario gráfica, Texto&#10;&#10;El contenido generado por IA puede ser incorrecto."/>
+                    <pic:cNvPicPr/>
+                  </pic:nvPicPr>
+                  <pic:blipFill>
+                    <a:blip r:embed="rId7"/>
+                    <a:stretch>
+                      <a:fillRect/>
+                    </a:stretch>
+                  </pic:blipFill>
+                  <pic:spPr>
+                    <a:xfrm>
+                      <a:off x="0" y="0"/>
+                      <a:ext cx="5400040" cy="6067425"/>
+                    </a:xfrm>
+                    <a:prstGeom prst="rect">
+                      <a:avLst/>
+                    </a:prstGeom>
+                  </pic:spPr>
+                </pic:pic>
+              </a:graphicData>
+            </a:graphic>
+          </wp:inline>
+        </w:drawing>
+      </w:r>
+    </w:p>
+    <w:p>
+      <w:pPr>
+        <w:numPr>
+          <w:ilvl w:val="0"/>
+          <w:numId w:val="2"/>
+        </w:numPr>
+      </w:pPr>
+      <w:r>
+        <w:t xml:space="preserve">#00754A sobre #FFFFFF → </w:t>
+      </w:r>
+      <w:r>
+        <w:rPr>
+          <w:b/>
+          <w:bCs/>
+        </w:rPr>
+        <w:t>5.76 : 1</w:t>
+      </w:r>
+      <w:r>
+        <w:t xml:space="preserve"> → </w:t>
+      </w:r>
+      <w:r>
+        <w:rPr>
+          <w:b/>
+          <w:bCs/>
+        </w:rPr>
+        <w:t>Cumple AA</w:t>
+      </w:r>
+      <w:r>
+        <w:t xml:space="preserve"> (texto normal), </w:t>
+      </w:r>
+      <w:r>
+        <w:rPr>
+          <w:b/>
+          <w:bCs/>
+        </w:rPr>
+        <w:t>no AAA</w:t>
+      </w:r>
+      <w:r>
+        <w:t xml:space="preserve"> para texto normal (sí AAA para texto grande).</w:t>
+      </w:r>
+    </w:p>
+    <w:p>
+      <w:pPr>
+        <w:ind w:left="360"/>
+      </w:pPr>
+      <w:r>
+        <w:rPr>
+          <w:noProof/>
+        </w:rPr>
+        <w:lastRenderedPageBreak/>
+        <w:drawing>
+          <wp:inline distT="0" distB="0" distL="0" distR="0" wp14:anchorId="6FFFE086" wp14:editId="1087D9B9">
+            <wp:extent cx="5400040" cy="5703570"/>
+            <wp:effectExtent l="0" t="0" r="0" b="0"/>
+            <wp:docPr id="726054792" name="Imagen 1" descr="Interfaz de usuario gráfica&#10;&#10;El contenido generado por IA puede ser incorrecto."/>
+            <wp:cNvGraphicFramePr>
+              <a:graphicFrameLocks xmlns:a="http://schemas.openxmlformats.org/drawingml/2006/main" noChangeAspect="1"/>
+            </wp:cNvGraphicFramePr>
+            <a:graphic xmlns:a="http://schemas.openxmlformats.org/drawingml/2006/main">
+              <a:graphicData uri="http://schemas.openxmlformats.org/drawingml/2006/picture">
+                <pic:pic xmlns:pic="http://schemas.openxmlformats.org/drawingml/2006/picture">
+                  <pic:nvPicPr>
+                    <pic:cNvPr id="726054792" name="Imagen 1" descr="Interfaz de usuario gráfica&#10;&#10;El contenido generado por IA puede ser incorrecto."/>
+                    <pic:cNvPicPr/>
+                  </pic:nvPicPr>
+                  <pic:blipFill>
+                    <a:blip r:embed="rId8"/>
+                    <a:stretch>
+                      <a:fillRect/>
+                    </a:stretch>
+                  </pic:blipFill>
+                  <pic:spPr>
+                    <a:xfrm>
+                      <a:off x="0" y="0"/>
+                      <a:ext cx="5400040" cy="5703570"/>
+                    </a:xfrm>
+                    <a:prstGeom prst="rect">
+                      <a:avLst/>
+                    </a:prstGeom>
+                  </pic:spPr>
+                </pic:pic>
+              </a:graphicData>
+            </a:graphic>
+          </wp:inline>
+        </w:drawing>
+      </w:r>
+    </w:p>
+    <w:p>
+      <w:pPr>
+        <w:numPr>
+          <w:ilvl w:val="0"/>
+          <w:numId w:val="2"/>
+        </w:numPr>
+      </w:pPr>
+      <w:r>
+        <w:t xml:space="preserve">#111111 sobre #FFFFFF → </w:t>
+      </w:r>
+      <w:r>
+        <w:rPr>
+          <w:b/>
+          <w:bCs/>
+        </w:rPr>
+        <w:t>18.88 : 1</w:t>
+      </w:r>
+      <w:r>
+        <w:t xml:space="preserve"> → </w:t>
+      </w:r>
+      <w:r>
+        <w:rPr>
+          <w:b/>
+          <w:bCs/>
+        </w:rPr>
+        <w:t>Cumple AA y AAA</w:t>
+      </w:r>
+      <w:r>
+        <w:t xml:space="preserve"> (texto normal y grande).</w:t>
+      </w:r>
+    </w:p>
+    <w:p>
+      <w:r>
+        <w:rPr>
+          <w:noProof/>
+        </w:rPr>
+        <w:lastRenderedPageBreak/>
+        <w:drawing>
+          <wp:inline distT="0" distB="0" distL="0" distR="0" wp14:anchorId="28B816CC" wp14:editId="494AC027">
+            <wp:extent cx="5400040" cy="5550535"/>
+            <wp:effectExtent l="0" t="0" r="0" b="0"/>
+            <wp:docPr id="638793377" name="Imagen 1" descr="Interfaz de usuario gráfica, Texto, Aplicación&#10;&#10;El contenido generado por IA puede ser incorrecto."/>
+            <wp:cNvGraphicFramePr>
+              <a:graphicFrameLocks xmlns:a="http://schemas.openxmlformats.org/drawingml/2006/main" noChangeAspect="1"/>
+            </wp:cNvGraphicFramePr>
+            <a:graphic xmlns:a="http://schemas.openxmlformats.org/drawingml/2006/main">
+              <a:graphicData uri="http://schemas.openxmlformats.org/drawingml/2006/picture">
+                <pic:pic xmlns:pic="http://schemas.openxmlformats.org/drawingml/2006/picture">
+                  <pic:nvPicPr>
+                    <pic:cNvPr id="638793377" name="Imagen 1" descr="Interfaz de usuario gráfica, Texto, Aplicación&#10;&#10;El contenido generado por IA puede ser incorrecto."/>
+                    <pic:cNvPicPr/>
+                  </pic:nvPicPr>
+                  <pic:blipFill>
+                    <a:blip r:embed="rId9"/>
+                    <a:stretch>
+                      <a:fillRect/>
+                    </a:stretch>
+                  </pic:blipFill>
+                  <pic:spPr>
+                    <a:xfrm>
+                      <a:off x="0" y="0"/>
+                      <a:ext cx="5400040" cy="5550535"/>
+                    </a:xfrm>
+                    <a:prstGeom prst="rect">
+                      <a:avLst/>
+                    </a:prstGeom>
+                  </pic:spPr>
+                </pic:pic>
+              </a:graphicData>
+            </a:graphic>
+          </wp:inline>
+        </w:drawing>
+      </w:r>
+    </w:p>
+    <w:p>
+      <w:pPr>
+        <w:numPr>
+          <w:ilvl w:val="0"/>
+          <w:numId w:val="2"/>
+        </w:numPr>
+      </w:pPr>
+      <w:r>
+        <w:lastRenderedPageBreak/>
+        <w:t xml:space="preserve">#000000 sobre #FFFFFF → </w:t>
+      </w:r>
+      <w:r>
+        <w:rPr>
+          <w:b/>
+          <w:bCs/>
+        </w:rPr>
+        <w:t>21.00 : 1</w:t>
+      </w:r>
+      <w:r>
+        <w:t xml:space="preserve"> → </w:t>
+      </w:r>
+      <w:r>
+        <w:rPr>
+          <w:b/>
+          <w:bCs/>
+        </w:rPr>
+        <w:t>Cumple AA y AAA</w:t>
+      </w:r>
       <w:r>
         <w:t xml:space="preserve"> </w:t>
       </w:r>
-      <w:proofErr w:type="spellStart"/>
-      <w:r>
-        <w:t>Checker</w:t>
-      </w:r>
-      <w:proofErr w:type="spellEnd"/>
-      <w:r>
-        <w:t xml:space="preserve">, visualización del sitio en modo texto mediante </w:t>
-      </w:r>
-      <w:proofErr w:type="spellStart"/>
-      <w:r>
-        <w:t>Textise</w:t>
-      </w:r>
-      <w:proofErr w:type="spellEnd"/>
-      <w:r>
-        <w:t xml:space="preserve"> y evaluación con </w:t>
-      </w:r>
-      <w:proofErr w:type="spellStart"/>
-      <w:r>
-        <w:t>Accessibility</w:t>
-      </w:r>
-      <w:proofErr w:type="spellEnd"/>
-      <w:r>
-        <w:t xml:space="preserve"> </w:t>
-      </w:r>
-      <w:proofErr w:type="spellStart"/>
-      <w:r>
-        <w:t>Checker</w:t>
-      </w:r>
-      <w:proofErr w:type="spellEnd"/>
-      <w:r>
-        <w:t xml:space="preserve">. </w:t>
-      </w:r>
-      <w:r>
-        <w:t>Además,</w:t>
-      </w:r>
-      <w:r>
-        <w:t xml:space="preserve"> se proponen soluciones y mejoras para alcanzar los niveles de conformidad WCAG recomendados.</w:t>
-      </w:r>
-    </w:p>
-    <w:p>
-      <w:pPr>
-        <w:rPr>
-          <w:b/>
-          <w:bCs/>
-        </w:rPr>
-      </w:pPr>
-      <w:r>
-        <w:rPr>
-          <w:b/>
-          <w:bCs/>
-        </w:rPr>
-        <w:t>_____________________________________________________________________________</w:t>
-      </w:r>
-    </w:p>
-    <w:p>
-      <w:pPr>
-        <w:rPr>
-          <w:b/>
-          <w:bCs/>
-        </w:rPr>
-      </w:pPr>
-      <w:r>
-        <w:rPr>
-          <w:b/>
-          <w:bCs/>
-        </w:rPr>
-        <w:t>TAREA 1 — Contraste de colores (</w:t>
-      </w:r>
-      <w:proofErr w:type="spellStart"/>
-      <w:r>
-        <w:rPr>
-          <w:b/>
-          <w:bCs/>
-        </w:rPr>
-        <w:t>Contrast</w:t>
-      </w:r>
-      <w:proofErr w:type="spellEnd"/>
-      <w:r>
-        <w:rPr>
-          <w:b/>
-          <w:bCs/>
-        </w:rPr>
-        <w:t xml:space="preserve"> </w:t>
-      </w:r>
-      <w:proofErr w:type="spellStart"/>
-      <w:r>
-        <w:rPr>
-          <w:b/>
-          <w:bCs/>
-        </w:rPr>
-        <w:t>Checker</w:t>
-      </w:r>
-      <w:proofErr w:type="spellEnd"/>
-      <w:r>
-        <w:rPr>
-          <w:b/>
-          <w:bCs/>
-        </w:rPr>
-        <w:t>)</w:t>
-      </w:r>
-    </w:p>
-    <w:p>
-      <w:pPr>
-        <w:rPr>
-          <w:b/>
-          <w:bCs/>
-        </w:rPr>
-      </w:pPr>
-      <w:r>
-        <w:rPr>
-          <w:b/>
-          <w:bCs/>
-        </w:rPr>
-        <w:t>1.1. Paleta tomada (valores usados)</w:t>
-      </w:r>
-    </w:p>
-    <w:p>
-      <w:pPr>
-        <w:numPr>
-          <w:ilvl w:val="0"/>
-          <w:numId w:val="1"/>
-        </w:numPr>
-      </w:pPr>
-      <w:r>
-        <w:t>Verde principal: #006241</w:t>
-      </w:r>
-    </w:p>
-    <w:p>
-      <w:pPr>
-        <w:numPr>
-          <w:ilvl w:val="0"/>
-          <w:numId w:val="1"/>
-        </w:numPr>
-      </w:pPr>
-      <w:r>
-        <w:t>Verde secundario: #00754A</w:t>
-      </w:r>
-    </w:p>
-    <w:p>
-      <w:pPr>
-        <w:numPr>
-          <w:ilvl w:val="0"/>
-          <w:numId w:val="1"/>
-        </w:numPr>
-      </w:pPr>
-      <w:r>
-        <w:t>Neutro cálido: #F2F0EB</w:t>
-      </w:r>
-    </w:p>
-    <w:p>
-      <w:pPr>
-        <w:numPr>
-          <w:ilvl w:val="0"/>
-          <w:numId w:val="1"/>
-        </w:numPr>
-      </w:pPr>
-      <w:r>
-        <w:t>Blanco: #FFFFFF</w:t>
-      </w:r>
-    </w:p>
-    <w:p>
-      <w:pPr>
-        <w:numPr>
-          <w:ilvl w:val="0"/>
-          <w:numId w:val="1"/>
-        </w:numPr>
-      </w:pPr>
-      <w:r>
-        <w:t>Negro carbón: #111111</w:t>
-      </w:r>
-    </w:p>
-    <w:p>
-      <w:pPr>
-        <w:numPr>
-          <w:ilvl w:val="0"/>
-          <w:numId w:val="1"/>
-        </w:numPr>
-      </w:pPr>
-      <w:r>
-        <w:t xml:space="preserve">(También incluyo colores de acento del proyecto </w:t>
-      </w:r>
-      <w:proofErr w:type="spellStart"/>
-      <w:r>
-        <w:t>Hard</w:t>
-      </w:r>
-      <w:proofErr w:type="spellEnd"/>
-      <w:r>
-        <w:t xml:space="preserve"> Enduro por comparación: Rojo #D72638, Naranja #FF6B00)</w:t>
-      </w:r>
-    </w:p>
-    <w:p>
-      <w:r>
-        <w:t xml:space="preserve">He comprobado las combinaciones principales y calculado la </w:t>
-      </w:r>
-      <w:r>
-        <w:rPr>
-          <w:b/>
-          <w:bCs/>
-        </w:rPr>
-        <w:t>ratio de contraste</w:t>
-      </w:r>
-      <w:r>
-        <w:t xml:space="preserve"> (WCAG) entre los pares relevantes.</w:t>
-      </w:r>
-    </w:p>
-    <w:p>
-      <w:pPr>
-        <w:rPr>
-          <w:b/>
-          <w:bCs/>
-        </w:rPr>
-      </w:pPr>
-      <w:r>
-        <w:rPr>
-          <w:b/>
-          <w:bCs/>
-        </w:rPr>
-        <w:t>1.2. Resultados (</w:t>
-      </w:r>
-      <w:proofErr w:type="spellStart"/>
-      <w:r>
-        <w:rPr>
-          <w:b/>
-          <w:bCs/>
-        </w:rPr>
-        <w:t>contrast</w:t>
-      </w:r>
-      <w:proofErr w:type="spellEnd"/>
-      <w:r>
-        <w:rPr>
-          <w:b/>
-          <w:bCs/>
-        </w:rPr>
-        <w:t xml:space="preserve"> ratio calculada)</w:t>
-      </w:r>
-    </w:p>
-    <w:p>
-      <w:r>
-        <w:t>(Valores calculados con la fórmula WCAG 2.0; redondeados a 2 decimales)</w:t>
+      <w:r>
+        <w:rPr>
+          <w:noProof/>
+        </w:rPr>
+        <w:drawing>
+          <wp:inline distT="0" distB="0" distL="0" distR="0" wp14:anchorId="0BD7CDD4" wp14:editId="7EA605E3">
+            <wp:extent cx="5400040" cy="5812155"/>
+            <wp:effectExtent l="0" t="0" r="0" b="0"/>
+            <wp:docPr id="1277321933" name="Imagen 1" descr="Interfaz de usuario gráfica, Aplicación&#10;&#10;El contenido generado por IA puede ser incorrecto."/>
+            <wp:cNvGraphicFramePr>
+              <a:graphicFrameLocks xmlns:a="http://schemas.openxmlformats.org/drawingml/2006/main" noChangeAspect="1"/>
+            </wp:cNvGraphicFramePr>
+            <a:graphic xmlns:a="http://schemas.openxmlformats.org/drawingml/2006/main">
+              <a:graphicData uri="http://schemas.openxmlformats.org/drawingml/2006/picture">
+                <pic:pic xmlns:pic="http://schemas.openxmlformats.org/drawingml/2006/picture">
+                  <pic:nvPicPr>
+                    <pic:cNvPr id="1277321933" name="Imagen 1" descr="Interfaz de usuario gráfica, Aplicación&#10;&#10;El contenido generado por IA puede ser incorrecto."/>
+                    <pic:cNvPicPr/>
+                  </pic:nvPicPr>
+                  <pic:blipFill>
+                    <a:blip r:embed="rId10"/>
+                    <a:stretch>
+                      <a:fillRect/>
+                    </a:stretch>
+                  </pic:blipFill>
+                  <pic:spPr>
+                    <a:xfrm>
+                      <a:off x="0" y="0"/>
+                      <a:ext cx="5400040" cy="5812155"/>
+                    </a:xfrm>
+                    <a:prstGeom prst="rect">
+                      <a:avLst/>
+                    </a:prstGeom>
+                  </pic:spPr>
+                </pic:pic>
+              </a:graphicData>
+            </a:graphic>
+          </wp:inline>
+        </w:drawing>
       </w:r>
     </w:p>
     <w:p>
@@ -281,7 +503,147 @@
         </w:numPr>
       </w:pPr>
       <w:r>
-        <w:t xml:space="preserve">#006241 sobre #FFFFFF → </w:t>
+        <w:t xml:space="preserve">#006241 sobre #F2F0EB → </w:t>
+      </w:r>
+      <w:r>
+        <w:rPr>
+          <w:b/>
+          <w:bCs/>
+        </w:rPr>
+        <w:t>6.53 : 1</w:t>
+      </w:r>
+      <w:r>
+        <w:t xml:space="preserve"> → </w:t>
+      </w:r>
+      <w:r>
+        <w:rPr>
+          <w:b/>
+          <w:bCs/>
+        </w:rPr>
+        <w:t xml:space="preserve">Cumple AA </w:t>
+      </w:r>
+      <w:r>
+        <w:rPr>
+          <w:b/>
+          <w:bCs/>
+        </w:rPr>
+        <w:t>en texto normal y AA y AAA en texto grande</w:t>
+      </w:r>
+    </w:p>
+    <w:p>
+      <w:r>
+        <w:rPr>
+          <w:noProof/>
+        </w:rPr>
+        <w:lastRenderedPageBreak/>
+        <w:drawing>
+          <wp:inline distT="0" distB="0" distL="0" distR="0" wp14:anchorId="5BF3386E" wp14:editId="2E260BFD">
+            <wp:extent cx="5400040" cy="5968365"/>
+            <wp:effectExtent l="0" t="0" r="0" b="0"/>
+            <wp:docPr id="1466209000" name="Imagen 1" descr="Interfaz de usuario gráfica&#10;&#10;El contenido generado por IA puede ser incorrecto."/>
+            <wp:cNvGraphicFramePr>
+              <a:graphicFrameLocks xmlns:a="http://schemas.openxmlformats.org/drawingml/2006/main" noChangeAspect="1"/>
+            </wp:cNvGraphicFramePr>
+            <a:graphic xmlns:a="http://schemas.openxmlformats.org/drawingml/2006/main">
+              <a:graphicData uri="http://schemas.openxmlformats.org/drawingml/2006/picture">
+                <pic:pic xmlns:pic="http://schemas.openxmlformats.org/drawingml/2006/picture">
+                  <pic:nvPicPr>
+                    <pic:cNvPr id="1466209000" name="Imagen 1" descr="Interfaz de usuario gráfica&#10;&#10;El contenido generado por IA puede ser incorrecto."/>
+                    <pic:cNvPicPr/>
+                  </pic:nvPicPr>
+                  <pic:blipFill>
+                    <a:blip r:embed="rId11"/>
+                    <a:stretch>
+                      <a:fillRect/>
+                    </a:stretch>
+                  </pic:blipFill>
+                  <pic:spPr>
+                    <a:xfrm>
+                      <a:off x="0" y="0"/>
+                      <a:ext cx="5400040" cy="5968365"/>
+                    </a:xfrm>
+                    <a:prstGeom prst="rect">
+                      <a:avLst/>
+                    </a:prstGeom>
+                  </pic:spPr>
+                </pic:pic>
+              </a:graphicData>
+            </a:graphic>
+          </wp:inline>
+        </w:drawing>
+      </w:r>
+    </w:p>
+    <w:p>
+      <w:pPr>
+        <w:numPr>
+          <w:ilvl w:val="0"/>
+          <w:numId w:val="2"/>
+        </w:numPr>
+      </w:pPr>
+      <w:r>
+        <w:t xml:space="preserve">#D72638 (rojo) sobre #FFFFFF → </w:t>
+      </w:r>
+      <w:r>
+        <w:rPr>
+          <w:b/>
+          <w:bCs/>
+        </w:rPr>
+        <w:t>4.97 : 1</w:t>
+      </w:r>
+      <w:r>
+        <w:t xml:space="preserve"> → </w:t>
+      </w:r>
+      <w:r>
+        <w:rPr>
+          <w:b/>
+          <w:bCs/>
+        </w:rPr>
+        <w:t>Cumple AA</w:t>
+      </w:r>
+      <w:r>
+        <w:t xml:space="preserve"> para texto normal (ligeramente por encima de 4.5).</w:t>
+      </w:r>
+    </w:p>
+    <w:p>
+      <w:pPr>
+        <w:numPr>
+          <w:ilvl w:val="0"/>
+          <w:numId w:val="2"/>
+        </w:numPr>
+      </w:pPr>
+      <w:r>
+        <w:t xml:space="preserve">#FF6B00 (naranja) sobre #FFFFFF → </w:t>
+      </w:r>
+      <w:r>
+        <w:rPr>
+          <w:b/>
+          <w:bCs/>
+        </w:rPr>
+        <w:t>2.86 : 1</w:t>
+      </w:r>
+      <w:r>
+        <w:t xml:space="preserve"> → </w:t>
+      </w:r>
+      <w:r>
+        <w:rPr>
+          <w:b/>
+          <w:bCs/>
+        </w:rPr>
+        <w:t>NO cumple AA</w:t>
+      </w:r>
+      <w:r>
+        <w:t xml:space="preserve"> (insuficiente para texto normal).</w:t>
+      </w:r>
+    </w:p>
+    <w:p>
+      <w:pPr>
+        <w:numPr>
+          <w:ilvl w:val="0"/>
+          <w:numId w:val="2"/>
+        </w:numPr>
+      </w:pPr>
+      <w:r>
+        <w:t xml:space="preserve">#FFFFFF sobre #006241 (texto blanco sobre fondo verde) → </w:t>
       </w:r>
       <w:r>
         <w:rPr>
@@ -298,10 +660,10 @@
           <w:b/>
           <w:bCs/>
         </w:rPr>
-        <w:t>Cumple AA y AAA</w:t>
-      </w:r>
-      <w:r>
-        <w:t xml:space="preserve"> (texto normal y grande).</w:t>
+        <w:t>Cumple AA/AAA</w:t>
+      </w:r>
+      <w:r>
+        <w:t>.</w:t>
       </w:r>
     </w:p>
     <w:p>
@@ -312,7 +674,7 @@
         </w:numPr>
       </w:pPr>
       <w:r>
-        <w:t xml:space="preserve">#00754A sobre #FFFFFF → </w:t>
+        <w:t xml:space="preserve">#FFFFFF sobre #00754A → </w:t>
       </w:r>
       <w:r>
         <w:rPr>
@@ -332,17 +694,7 @@
         <w:t>Cumple AA</w:t>
       </w:r>
       <w:r>
-        <w:t xml:space="preserve"> (texto normal), </w:t>
-      </w:r>
-      <w:r>
-        <w:rPr>
-          <w:b/>
-          <w:bCs/>
-        </w:rPr>
-        <w:t>no AAA</w:t>
-      </w:r>
-      <w:r>
-        <w:t xml:space="preserve"> para texto normal (sí AAA para texto grande).</w:t>
+        <w:t>.</w:t>
       </w:r>
     </w:p>
     <w:p>
@@ -353,14 +705,14 @@
         </w:numPr>
       </w:pPr>
       <w:r>
-        <w:t xml:space="preserve">#111111 sobre #FFFFFF → </w:t>
-      </w:r>
-      <w:r>
-        <w:rPr>
-          <w:b/>
-          <w:bCs/>
-        </w:rPr>
-        <w:t>18.88 : 1</w:t>
+        <w:t xml:space="preserve">#FFFFFF sobre #D72638 → </w:t>
+      </w:r>
+      <w:r>
+        <w:rPr>
+          <w:b/>
+          <w:bCs/>
+        </w:rPr>
+        <w:t>4.97 : 1</w:t>
       </w:r>
       <w:r>
         <w:t xml:space="preserve"> → </w:t>
@@ -370,6 +722,37 @@
           <w:b/>
           <w:bCs/>
         </w:rPr>
+        <w:t>Cumple AA</w:t>
+      </w:r>
+      <w:r>
+        <w:t>.</w:t>
+      </w:r>
+    </w:p>
+    <w:p>
+      <w:pPr>
+        <w:numPr>
+          <w:ilvl w:val="0"/>
+          <w:numId w:val="2"/>
+        </w:numPr>
+      </w:pPr>
+      <w:r>
+        <w:t xml:space="preserve">#111111 sobre #F2F0EB → </w:t>
+      </w:r>
+      <w:r>
+        <w:rPr>
+          <w:b/>
+          <w:bCs/>
+        </w:rPr>
+        <w:t>16.58 : 1</w:t>
+      </w:r>
+      <w:r>
+        <w:t xml:space="preserve"> → </w:t>
+      </w:r>
+      <w:r>
+        <w:rPr>
+          <w:b/>
+          <w:bCs/>
+        </w:rPr>
         <w:t>Cumple AAA</w:t>
       </w:r>
       <w:r>
@@ -378,280 +761,32 @@
     </w:p>
     <w:p>
       <w:pPr>
-        <w:numPr>
-          <w:ilvl w:val="0"/>
-          <w:numId w:val="2"/>
-        </w:numPr>
-      </w:pPr>
-      <w:r>
-        <w:t xml:space="preserve">#000000 sobre #FFFFFF → </w:t>
-      </w:r>
-      <w:r>
-        <w:rPr>
-          <w:b/>
-          <w:bCs/>
-        </w:rPr>
-        <w:t>21.00 : 1</w:t>
-      </w:r>
-      <w:r>
-        <w:t xml:space="preserve"> → </w:t>
-      </w:r>
-      <w:r>
-        <w:rPr>
-          <w:b/>
-          <w:bCs/>
-        </w:rPr>
-        <w:t>Cumple AAA</w:t>
-      </w:r>
-      <w:r>
-        <w:t>.</w:t>
-      </w:r>
-    </w:p>
-    <w:p>
-      <w:pPr>
-        <w:numPr>
-          <w:ilvl w:val="0"/>
-          <w:numId w:val="2"/>
-        </w:numPr>
-      </w:pPr>
-      <w:r>
-        <w:t xml:space="preserve">#006241 sobre #F2F0EB → </w:t>
-      </w:r>
-      <w:r>
-        <w:rPr>
-          <w:b/>
-          <w:bCs/>
-        </w:rPr>
-        <w:t>6.53 : 1</w:t>
-      </w:r>
-      <w:r>
-        <w:t xml:space="preserve"> → </w:t>
-      </w:r>
-      <w:r>
-        <w:rPr>
-          <w:b/>
-          <w:bCs/>
-        </w:rPr>
-        <w:t>Cumple AA</w:t>
-      </w:r>
-      <w:r>
-        <w:t>.</w:t>
-      </w:r>
-    </w:p>
-    <w:p>
-      <w:pPr>
-        <w:numPr>
-          <w:ilvl w:val="0"/>
-          <w:numId w:val="2"/>
-        </w:numPr>
-      </w:pPr>
-      <w:r>
-        <w:t xml:space="preserve">#D72638 (rojo) sobre #FFFFFF → </w:t>
-      </w:r>
-      <w:r>
-        <w:rPr>
-          <w:b/>
-          <w:bCs/>
-        </w:rPr>
-        <w:t>4.97 : 1</w:t>
-      </w:r>
-      <w:r>
-        <w:t xml:space="preserve"> → </w:t>
-      </w:r>
-      <w:r>
-        <w:rPr>
-          <w:b/>
-          <w:bCs/>
-        </w:rPr>
-        <w:t>Cumple AA</w:t>
-      </w:r>
-      <w:r>
-        <w:t xml:space="preserve"> para texto normal (ligeramente por encima de 4.5).</w:t>
-      </w:r>
-    </w:p>
-    <w:p>
-      <w:pPr>
-        <w:numPr>
-          <w:ilvl w:val="0"/>
-          <w:numId w:val="2"/>
-        </w:numPr>
-      </w:pPr>
-      <w:r>
-        <w:t xml:space="preserve">#FF6B00 (naranja) sobre #FFFFFF → </w:t>
-      </w:r>
-      <w:r>
-        <w:rPr>
-          <w:b/>
-          <w:bCs/>
-        </w:rPr>
-        <w:t>2.86 : 1</w:t>
-      </w:r>
-      <w:r>
-        <w:t xml:space="preserve"> → </w:t>
-      </w:r>
-      <w:r>
-        <w:rPr>
-          <w:b/>
-          <w:bCs/>
-        </w:rPr>
-        <w:t>NO cumple AA</w:t>
-      </w:r>
-      <w:r>
-        <w:t xml:space="preserve"> (insuficiente para texto normal).</w:t>
-      </w:r>
-    </w:p>
-    <w:p>
-      <w:pPr>
-        <w:numPr>
-          <w:ilvl w:val="0"/>
-          <w:numId w:val="2"/>
-        </w:numPr>
-      </w:pPr>
-      <w:r>
+        <w:rPr>
+          <w:b/>
+          <w:bCs/>
+        </w:rPr>
+      </w:pPr>
+      <w:r>
+        <w:rPr>
+          <w:b/>
+          <w:bCs/>
+        </w:rPr>
+        <w:t>1.3. Interpretación (WCAG 2.1)</w:t>
+      </w:r>
+    </w:p>
+    <w:p>
+      <w:pPr>
+        <w:numPr>
+          <w:ilvl w:val="0"/>
+          <w:numId w:val="3"/>
+        </w:numPr>
+      </w:pPr>
+      <w:r>
+        <w:rPr>
+          <w:b/>
+          <w:bCs/>
+        </w:rPr>
         <w:lastRenderedPageBreak/>
-        <w:t xml:space="preserve">#FFFFFF sobre #006241 (texto blanco sobre fondo verde) → </w:t>
-      </w:r>
-      <w:r>
-        <w:rPr>
-          <w:b/>
-          <w:bCs/>
-        </w:rPr>
-        <w:t>7.44 : 1</w:t>
-      </w:r>
-      <w:r>
-        <w:t xml:space="preserve"> → </w:t>
-      </w:r>
-      <w:r>
-        <w:rPr>
-          <w:b/>
-          <w:bCs/>
-        </w:rPr>
-        <w:t>Cumple AA/AAA</w:t>
-      </w:r>
-      <w:r>
-        <w:t>.</w:t>
-      </w:r>
-    </w:p>
-    <w:p>
-      <w:pPr>
-        <w:numPr>
-          <w:ilvl w:val="0"/>
-          <w:numId w:val="2"/>
-        </w:numPr>
-      </w:pPr>
-      <w:r>
-        <w:t xml:space="preserve">#FFFFFF sobre #00754A → </w:t>
-      </w:r>
-      <w:r>
-        <w:rPr>
-          <w:b/>
-          <w:bCs/>
-        </w:rPr>
-        <w:t>5.76 : 1</w:t>
-      </w:r>
-      <w:r>
-        <w:t xml:space="preserve"> → </w:t>
-      </w:r>
-      <w:r>
-        <w:rPr>
-          <w:b/>
-          <w:bCs/>
-        </w:rPr>
-        <w:t>Cumple AA</w:t>
-      </w:r>
-      <w:r>
-        <w:t>.</w:t>
-      </w:r>
-    </w:p>
-    <w:p>
-      <w:pPr>
-        <w:numPr>
-          <w:ilvl w:val="0"/>
-          <w:numId w:val="2"/>
-        </w:numPr>
-      </w:pPr>
-      <w:r>
-        <w:t xml:space="preserve">#FFFFFF sobre #D72638 → </w:t>
-      </w:r>
-      <w:r>
-        <w:rPr>
-          <w:b/>
-          <w:bCs/>
-        </w:rPr>
-        <w:t>4.97 : 1</w:t>
-      </w:r>
-      <w:r>
-        <w:t xml:space="preserve"> → </w:t>
-      </w:r>
-      <w:r>
-        <w:rPr>
-          <w:b/>
-          <w:bCs/>
-        </w:rPr>
-        <w:t>Cumple AA</w:t>
-      </w:r>
-      <w:r>
-        <w:t>.</w:t>
-      </w:r>
-    </w:p>
-    <w:p>
-      <w:pPr>
-        <w:numPr>
-          <w:ilvl w:val="0"/>
-          <w:numId w:val="2"/>
-        </w:numPr>
-      </w:pPr>
-      <w:r>
-        <w:t xml:space="preserve">#111111 sobre #F2F0EB → </w:t>
-      </w:r>
-      <w:r>
-        <w:rPr>
-          <w:b/>
-          <w:bCs/>
-        </w:rPr>
-        <w:t>16.58 : 1</w:t>
-      </w:r>
-      <w:r>
-        <w:t xml:space="preserve"> → </w:t>
-      </w:r>
-      <w:r>
-        <w:rPr>
-          <w:b/>
-          <w:bCs/>
-        </w:rPr>
-        <w:t>Cumple AAA</w:t>
-      </w:r>
-      <w:r>
-        <w:t>.</w:t>
-      </w:r>
-    </w:p>
-    <w:p>
-      <w:pPr>
-        <w:rPr>
-          <w:b/>
-          <w:bCs/>
-        </w:rPr>
-      </w:pPr>
-      <w:r>
-        <w:rPr>
-          <w:b/>
-          <w:bCs/>
-        </w:rPr>
-        <w:t>1.3. Interpretación (WCAG 2.1)</w:t>
-      </w:r>
-    </w:p>
-    <w:p>
-      <w:pPr>
-        <w:numPr>
-          <w:ilvl w:val="0"/>
-          <w:numId w:val="3"/>
-        </w:numPr>
-      </w:pPr>
-      <w:r>
-        <w:rPr>
-          <w:b/>
-          <w:bCs/>
-        </w:rPr>
         <w:t>AA (texto normal):</w:t>
       </w:r>
       <w:r>
@@ -873,15 +1008,7 @@
         <w:t>Para botones de acento naranja</w:t>
       </w:r>
       <w:r>
-        <w:t xml:space="preserve">: usar texto negro o añadir un </w:t>
-      </w:r>
-      <w:proofErr w:type="spellStart"/>
-      <w:r>
-        <w:t>outline</w:t>
-      </w:r>
-      <w:proofErr w:type="spellEnd"/>
-      <w:r>
-        <w:t xml:space="preserve"> oscuro y aumentar peso/tamaño de la tipografía si debe mantenerse texto blanco.</w:t>
+        <w:t>: usar texto negro o añadir un outline oscuro y aumentar peso/tamaño de la tipografía si debe mantenerse texto blanco.</w:t>
       </w:r>
     </w:p>
     <w:p>
@@ -914,172 +1041,87 @@
           <w:b/>
           <w:bCs/>
         </w:rPr>
-        <w:t>Comprobar combinaciones en elementos de estado (</w:t>
-      </w:r>
-      <w:proofErr w:type="spellStart"/>
-      <w:r>
-        <w:rPr>
-          <w:b/>
-          <w:bCs/>
-        </w:rPr>
-        <w:t>placeholders</w:t>
-      </w:r>
-      <w:proofErr w:type="spellEnd"/>
-      <w:r>
-        <w:rPr>
-          <w:b/>
-          <w:bCs/>
-        </w:rPr>
-        <w:t xml:space="preserve">, </w:t>
-      </w:r>
-      <w:proofErr w:type="spellStart"/>
-      <w:r>
-        <w:rPr>
-          <w:b/>
-          <w:bCs/>
-        </w:rPr>
-        <w:t>labels</w:t>
-      </w:r>
-      <w:proofErr w:type="spellEnd"/>
-      <w:r>
-        <w:rPr>
-          <w:b/>
-          <w:bCs/>
-        </w:rPr>
-        <w:t xml:space="preserve"> atenuados):</w:t>
-      </w:r>
-      <w:r>
-        <w:t xml:space="preserve"> si se usan versiones atenuadas (grises claros), medir </w:t>
-      </w:r>
+        <w:t>Comprobar combinaciones en elementos de estado (placeholders, labels atenuados):</w:t>
+      </w:r>
+      <w:r>
+        <w:t xml:space="preserve"> si se usan versiones atenuadas (grises claros), medir contraste contra fondo neutro #F2F0EB y ajustarlas para estar al menos en 4.5:1 para texto normal o 3:1 para texto grande.</w:t>
+      </w:r>
+    </w:p>
+    <w:p>
+      <w:pPr>
+        <w:numPr>
+          <w:ilvl w:val="0"/>
+          <w:numId w:val="5"/>
+        </w:numPr>
+      </w:pPr>
+      <w:r>
+        <w:rPr>
+          <w:b/>
+          <w:bCs/>
+        </w:rPr>
+        <w:t>Añadir estilo de foco visible</w:t>
+      </w:r>
+      <w:r>
+        <w:t xml:space="preserve"> en elementos interactivos (outline de alto contraste, por ejemplo 2px solid #FF6B00 con fondo oscuro o #111111).</w:t>
+      </w:r>
+    </w:p>
+    <w:p>
+      <w:pPr>
+        <w:rPr>
+          <w:b/>
+          <w:bCs/>
+        </w:rPr>
+      </w:pPr>
+      <w:r>
+        <w:rPr>
+          <w:b/>
+          <w:bCs/>
+        </w:rPr>
+        <w:t>1.5. Capturas a incluir en el PDF</w:t>
+      </w:r>
+    </w:p>
+    <w:p>
+      <w:pPr>
+        <w:numPr>
+          <w:ilvl w:val="0"/>
+          <w:numId w:val="6"/>
+        </w:numPr>
+      </w:pPr>
+      <w:r>
+        <w:t xml:space="preserve">Captura del resultado en </w:t>
+      </w:r>
+      <w:r>
+        <w:rPr>
+          <w:b/>
+          <w:bCs/>
+        </w:rPr>
+        <w:t>Contrast Checker</w:t>
+      </w:r>
+      <w:r>
+        <w:t xml:space="preserve"> con #FF6B00 vs #FFFFFF (mostrando que falla).</w:t>
+      </w:r>
+    </w:p>
+    <w:p>
+      <w:pPr>
+        <w:numPr>
+          <w:ilvl w:val="0"/>
+          <w:numId w:val="6"/>
+        </w:numPr>
+      </w:pPr>
+      <w:r>
+        <w:t>Captura de #006241 vs #FFFFFF (resultado OK).</w:t>
+      </w:r>
+    </w:p>
+    <w:p>
+      <w:pPr>
+        <w:numPr>
+          <w:ilvl w:val="0"/>
+          <w:numId w:val="6"/>
+        </w:numPr>
+      </w:pPr>
       <w:r>
         <w:lastRenderedPageBreak/>
-        <w:t>contraste contra fondo neutro #F2F0EB y ajustarlas para estar al menos en 4.5:1 para texto normal o 3:1 para texto grande.</w:t>
-      </w:r>
-    </w:p>
-    <w:p>
-      <w:pPr>
-        <w:numPr>
-          <w:ilvl w:val="0"/>
-          <w:numId w:val="5"/>
-        </w:numPr>
-      </w:pPr>
-      <w:r>
-        <w:rPr>
-          <w:b/>
-          <w:bCs/>
-        </w:rPr>
-        <w:t>Añadir estilo de foco visible</w:t>
-      </w:r>
-      <w:r>
-        <w:t xml:space="preserve"> en elementos interactivos (</w:t>
-      </w:r>
-      <w:proofErr w:type="spellStart"/>
-      <w:r>
-        <w:t>outline</w:t>
-      </w:r>
-      <w:proofErr w:type="spellEnd"/>
-      <w:r>
-        <w:t xml:space="preserve"> de alto contraste, por ejemplo 2px </w:t>
-      </w:r>
-      <w:proofErr w:type="spellStart"/>
-      <w:r>
-        <w:t>solid</w:t>
-      </w:r>
-      <w:proofErr w:type="spellEnd"/>
-      <w:r>
-        <w:t xml:space="preserve"> #FF6B00 con fondo oscuro o #111111).</w:t>
-      </w:r>
-    </w:p>
-    <w:p>
-      <w:pPr>
-        <w:rPr>
-          <w:b/>
-          <w:bCs/>
-        </w:rPr>
-      </w:pPr>
-      <w:r>
-        <w:rPr>
-          <w:b/>
-          <w:bCs/>
-        </w:rPr>
-        <w:t>1.5. Capturas a incluir en el PDF</w:t>
-      </w:r>
-    </w:p>
-    <w:p>
-      <w:pPr>
-        <w:numPr>
-          <w:ilvl w:val="0"/>
-          <w:numId w:val="6"/>
-        </w:numPr>
-      </w:pPr>
-      <w:r>
-        <w:t xml:space="preserve">Captura del resultado en </w:t>
-      </w:r>
-      <w:proofErr w:type="spellStart"/>
-      <w:r>
-        <w:rPr>
-          <w:b/>
-          <w:bCs/>
-        </w:rPr>
-        <w:t>Contrast</w:t>
-      </w:r>
-      <w:proofErr w:type="spellEnd"/>
-      <w:r>
-        <w:rPr>
-          <w:b/>
-          <w:bCs/>
-        </w:rPr>
-        <w:t xml:space="preserve"> </w:t>
-      </w:r>
-      <w:proofErr w:type="spellStart"/>
-      <w:r>
-        <w:rPr>
-          <w:b/>
-          <w:bCs/>
-        </w:rPr>
-        <w:t>Checker</w:t>
-      </w:r>
-      <w:proofErr w:type="spellEnd"/>
-      <w:r>
-        <w:t xml:space="preserve"> con #FF6B00 vs #FFFFFF (mostrando que falla).</w:t>
-      </w:r>
-    </w:p>
-    <w:p>
-      <w:pPr>
-        <w:numPr>
-          <w:ilvl w:val="0"/>
-          <w:numId w:val="6"/>
-        </w:numPr>
-      </w:pPr>
-      <w:r>
-        <w:t>Captura de #006241 vs #FFFFFF (resultado OK).</w:t>
-      </w:r>
-    </w:p>
-    <w:p>
-      <w:pPr>
-        <w:numPr>
-          <w:ilvl w:val="0"/>
-          <w:numId w:val="6"/>
-        </w:numPr>
-      </w:pPr>
-      <w:r>
-        <w:t xml:space="preserve">(Opcional) Captura con la propuesta aplicada (ej.: botón naranja con texto negro) y comprobación en </w:t>
-      </w:r>
-      <w:proofErr w:type="spellStart"/>
-      <w:r>
-        <w:t>Contrast</w:t>
-      </w:r>
-      <w:proofErr w:type="spellEnd"/>
-      <w:r>
-        <w:t xml:space="preserve"> </w:t>
-      </w:r>
-      <w:proofErr w:type="spellStart"/>
-      <w:r>
-        <w:t>Checker</w:t>
-      </w:r>
-      <w:proofErr w:type="spellEnd"/>
-      <w:r>
-        <w:t>.</w:t>
+        <w:t>(Opcional) Captura con la propuesta aplicada (ej.: botón naranja con texto negro) y comprobación en Contrast Checker.</w:t>
       </w:r>
     </w:p>
     <w:p>
@@ -1091,45 +1133,13 @@
         <w:t>Marcadores en documento Word:</w:t>
       </w:r>
       <w:r>
-        <w:t xml:space="preserve"> Inserta aquí la captura: [CAPTURA: </w:t>
-      </w:r>
-      <w:proofErr w:type="spellStart"/>
-      <w:r>
-        <w:t>Contrast</w:t>
-      </w:r>
-      <w:proofErr w:type="spellEnd"/>
-      <w:r>
-        <w:t xml:space="preserve"> </w:t>
-      </w:r>
-      <w:proofErr w:type="spellStart"/>
-      <w:r>
-        <w:t>Checker</w:t>
-      </w:r>
-      <w:proofErr w:type="spellEnd"/>
-      <w:r>
-        <w:t xml:space="preserve"> - naranja vs blanco] y [CAPTURA: </w:t>
-      </w:r>
-      <w:proofErr w:type="spellStart"/>
-      <w:r>
-        <w:t>Contrast</w:t>
-      </w:r>
-      <w:proofErr w:type="spellEnd"/>
-      <w:r>
-        <w:t xml:space="preserve"> </w:t>
-      </w:r>
-      <w:proofErr w:type="spellStart"/>
-      <w:r>
-        <w:t>Checker</w:t>
-      </w:r>
-      <w:proofErr w:type="spellEnd"/>
-      <w:r>
-        <w:t xml:space="preserve"> - verde vs blanco].</w:t>
+        <w:t xml:space="preserve"> Inserta aquí la captura: [CAPTURA: Contrast Checker - naranja vs blanco] y [CAPTURA: Contrast Checker - verde vs blanco].</w:t>
       </w:r>
     </w:p>
     <w:p>
       <w:r>
         <w:pict w14:anchorId="1A632E43">
-          <v:rect id="_x0000_i1037" style="width:0;height:1.5pt" o:hralign="center" o:hrstd="t" o:hr="t" fillcolor="#a0a0a0" stroked="f"/>
+          <v:rect id="_x0000_i1025" style="width:0;height:1.5pt" o:hralign="center" o:hrstd="t" o:hr="t" fillcolor="#a0a0a0" stroked="f"/>
         </w:pict>
       </w:r>
     </w:p>
@@ -1145,23 +1155,7 @@
           <w:b/>
           <w:bCs/>
         </w:rPr>
-        <w:t>TAREA 2 — Visualización en modo texto (</w:t>
-      </w:r>
-      <w:proofErr w:type="spellStart"/>
-      <w:r>
-        <w:rPr>
-          <w:b/>
-          <w:bCs/>
-        </w:rPr>
-        <w:t>Textise</w:t>
-      </w:r>
-      <w:proofErr w:type="spellEnd"/>
-      <w:r>
-        <w:rPr>
-          <w:b/>
-          <w:bCs/>
-        </w:rPr>
-        <w:t>)</w:t>
+        <w:t>TAREA 2 — Visualización en modo texto (Textise)</w:t>
       </w:r>
     </w:p>
     <w:p>
@@ -1198,23 +1192,7 @@
         </w:numPr>
       </w:pPr>
       <w:r>
-        <w:t>Introducir la URL de Starbucks (por ejemplo https://www.starbucks.es/) y obtener la vista en modo texto (</w:t>
-      </w:r>
-      <w:proofErr w:type="spellStart"/>
-      <w:r>
-        <w:t>plain</w:t>
-      </w:r>
-      <w:proofErr w:type="spellEnd"/>
-      <w:r>
-        <w:t xml:space="preserve"> </w:t>
-      </w:r>
-      <w:proofErr w:type="spellStart"/>
-      <w:r>
-        <w:t>text</w:t>
-      </w:r>
-      <w:proofErr w:type="spellEnd"/>
-      <w:r>
-        <w:t>).</w:t>
+        <w:t>Introducir la URL de Starbucks (por ejemplo https://www.starbucks.es/) y obtener la vista en modo texto (plain text).</w:t>
       </w:r>
     </w:p>
     <w:p>
@@ -1226,15 +1204,7 @@
         <w:t>Captura a incluir:</w:t>
       </w:r>
       <w:r>
-        <w:t xml:space="preserve"> [CAPTURA: Vista de Starbucks en </w:t>
-      </w:r>
-      <w:proofErr w:type="spellStart"/>
-      <w:r>
-        <w:t>Textise</w:t>
-      </w:r>
-      <w:proofErr w:type="spellEnd"/>
-      <w:r>
-        <w:t>]</w:t>
+        <w:t xml:space="preserve"> [CAPTURA: Vista de Starbucks en Textise]</w:t>
       </w:r>
     </w:p>
     <w:p>
@@ -1270,23 +1240,7 @@
           <w:b/>
           <w:bCs/>
         </w:rPr>
-        <w:t xml:space="preserve">Elementos que se interpretan bien en </w:t>
-      </w:r>
-      <w:proofErr w:type="spellStart"/>
-      <w:r>
-        <w:rPr>
-          <w:b/>
-          <w:bCs/>
-        </w:rPr>
-        <w:t>Textise</w:t>
-      </w:r>
-      <w:proofErr w:type="spellEnd"/>
-      <w:r>
-        <w:rPr>
-          <w:b/>
-          <w:bCs/>
-        </w:rPr>
-        <w:t>:</w:t>
+        <w:t>Elementos que se interpretan bien en Textise:</w:t>
       </w:r>
     </w:p>
     <w:p>
@@ -1354,97 +1308,72 @@
           <w:b/>
           <w:bCs/>
         </w:rPr>
+        <w:t>Imágenes de producto sin texto alternativo:</w:t>
+      </w:r>
+      <w:r>
+        <w:t xml:space="preserve"> si las imágenes carecen de alt, la información visual (ej. aspecto del producto o promociones) se pierde.</w:t>
+      </w:r>
+    </w:p>
+    <w:p>
+      <w:pPr>
+        <w:numPr>
+          <w:ilvl w:val="0"/>
+          <w:numId w:val="9"/>
+        </w:numPr>
+      </w:pPr>
+      <w:r>
+        <w:rPr>
+          <w:b/>
+          <w:bCs/>
+        </w:rPr>
+        <w:t>Contenido contextual o visual (banners promocionales con texto embebido en la imagen):</w:t>
+      </w:r>
+      <w:r>
+        <w:t xml:space="preserve"> se pierde si no hay texto alternativo o descripción.</w:t>
+      </w:r>
+    </w:p>
+    <w:p>
+      <w:pPr>
+        <w:numPr>
+          <w:ilvl w:val="0"/>
+          <w:numId w:val="9"/>
+        </w:numPr>
+      </w:pPr>
+      <w:r>
+        <w:rPr>
+          <w:b/>
+          <w:bCs/>
+        </w:rPr>
+        <w:t>Componentes interactivos (mapas, sliders, reproductores) quedan como enlaces vacíos o referencias sin interacción.</w:t>
+      </w:r>
+    </w:p>
+    <w:p>
+      <w:pPr>
+        <w:numPr>
+          <w:ilvl w:val="0"/>
+          <w:numId w:val="9"/>
+        </w:numPr>
+      </w:pPr>
+      <w:r>
+        <w:rPr>
+          <w:b/>
+          <w:bCs/>
+        </w:rPr>
+        <w:t>Microinteracciones y estados (ej.: “Añadido al carrito”) no se representan.</w:t>
+      </w:r>
+    </w:p>
+    <w:p>
+      <w:r>
+        <w:rPr>
+          <w:b/>
+          <w:bCs/>
+        </w:rPr>
         <w:lastRenderedPageBreak/>
-        <w:t>Imágenes de producto sin texto alternativo:</w:t>
-      </w:r>
-      <w:r>
-        <w:t xml:space="preserve"> si las imágenes carecen de </w:t>
-      </w:r>
-      <w:proofErr w:type="spellStart"/>
-      <w:r>
-        <w:t>alt</w:t>
-      </w:r>
-      <w:proofErr w:type="spellEnd"/>
-      <w:r>
-        <w:t>, la información visual (ej. aspecto del producto o promociones) se pierde.</w:t>
-      </w:r>
-    </w:p>
-    <w:p>
-      <w:pPr>
-        <w:numPr>
-          <w:ilvl w:val="0"/>
-          <w:numId w:val="9"/>
-        </w:numPr>
-      </w:pPr>
-      <w:r>
-        <w:rPr>
-          <w:b/>
-          <w:bCs/>
-        </w:rPr>
-        <w:t>Contenido contextual o visual (banners promocionales con texto embebido en la imagen):</w:t>
-      </w:r>
-      <w:r>
-        <w:t xml:space="preserve"> se pierde si no hay texto alternativo o descripción.</w:t>
-      </w:r>
-    </w:p>
-    <w:p>
-      <w:pPr>
-        <w:numPr>
-          <w:ilvl w:val="0"/>
-          <w:numId w:val="9"/>
-        </w:numPr>
-      </w:pPr>
-      <w:r>
-        <w:rPr>
-          <w:b/>
-          <w:bCs/>
-        </w:rPr>
-        <w:t>Componentes interactivos (mapas, sliders, reproductores) quedan como enlaces vacíos o referencias sin interacción.</w:t>
-      </w:r>
-    </w:p>
-    <w:p>
-      <w:pPr>
-        <w:numPr>
-          <w:ilvl w:val="0"/>
-          <w:numId w:val="9"/>
-        </w:numPr>
-      </w:pPr>
-      <w:proofErr w:type="spellStart"/>
-      <w:r>
-        <w:rPr>
-          <w:b/>
-          <w:bCs/>
-        </w:rPr>
-        <w:t>Microinteracciones</w:t>
-      </w:r>
-      <w:proofErr w:type="spellEnd"/>
-      <w:r>
-        <w:rPr>
-          <w:b/>
-          <w:bCs/>
-        </w:rPr>
-        <w:t xml:space="preserve"> y estados (ej.: “Añadido al carrito”) no se representan.</w:t>
-      </w:r>
-    </w:p>
-    <w:p>
-      <w:r>
-        <w:rPr>
-          <w:b/>
-          <w:bCs/>
-        </w:rPr>
         <w:t>Conclusión:</w:t>
       </w:r>
       <w:r>
         <w:br/>
-        <w:t xml:space="preserve">Con </w:t>
-      </w:r>
-      <w:proofErr w:type="spellStart"/>
-      <w:r>
-        <w:t>Textise</w:t>
-      </w:r>
-      <w:proofErr w:type="spellEnd"/>
-      <w:r>
-        <w:t xml:space="preserve"> se puede recuperar la </w:t>
+        <w:t xml:space="preserve">Con Textise se puede recuperar la </w:t>
       </w:r>
       <w:r>
         <w:rPr>
@@ -1454,96 +1383,32 @@
         <w:t>estructura textual y navegación básica</w:t>
       </w:r>
       <w:r>
-        <w:t xml:space="preserve">, pero se echa en falta descripciones alternativas (atributos </w:t>
-      </w:r>
-      <w:proofErr w:type="spellStart"/>
-      <w:r>
-        <w:t>alt</w:t>
-      </w:r>
-      <w:proofErr w:type="spellEnd"/>
-      <w:r>
-        <w:t xml:space="preserve">) y etiquetas ARIA que ofrezcan equivalentes textuales a los recursos visuales y a la interacción. Para usuarios que dependen solo de texto (lectores de pantalla), es esencial que </w:t>
-      </w:r>
-      <w:r>
-        <w:rPr>
-          <w:b/>
-          <w:bCs/>
-        </w:rPr>
-        <w:t xml:space="preserve">todas las imágenes importantes tengan </w:t>
-      </w:r>
-      <w:proofErr w:type="spellStart"/>
-      <w:r>
-        <w:rPr>
-          <w:b/>
-          <w:bCs/>
-        </w:rPr>
-        <w:t>alt</w:t>
-      </w:r>
-      <w:proofErr w:type="spellEnd"/>
-      <w:r>
-        <w:rPr>
-          <w:b/>
-          <w:bCs/>
-        </w:rPr>
-        <w:t xml:space="preserve"> significativos</w:t>
-      </w:r>
-      <w:r>
-        <w:t>, que los botones tengan aria-</w:t>
-      </w:r>
-      <w:proofErr w:type="spellStart"/>
-      <w:r>
-        <w:t>label</w:t>
-      </w:r>
-      <w:proofErr w:type="spellEnd"/>
-      <w:r>
-        <w:t xml:space="preserve"> cuando su texto sea insuficiente y que los elementos dinámicos anuncien cambios vía ARIA </w:t>
-      </w:r>
-      <w:proofErr w:type="spellStart"/>
-      <w:r>
-        <w:t>live</w:t>
-      </w:r>
-      <w:proofErr w:type="spellEnd"/>
-      <w:r>
-        <w:t xml:space="preserve"> </w:t>
-      </w:r>
-      <w:proofErr w:type="spellStart"/>
-      <w:r>
-        <w:t>regions</w:t>
-      </w:r>
-      <w:proofErr w:type="spellEnd"/>
-      <w:r>
-        <w:t>.</w:t>
-      </w:r>
-    </w:p>
-    <w:p>
-      <w:pPr>
-        <w:rPr>
-          <w:b/>
-          <w:bCs/>
-        </w:rPr>
-      </w:pPr>
-      <w:r>
-        <w:rPr>
-          <w:b/>
-          <w:bCs/>
-        </w:rPr>
-        <w:t>2.3. Propuestas de mejora (</w:t>
-      </w:r>
-      <w:proofErr w:type="spellStart"/>
-      <w:r>
-        <w:rPr>
-          <w:b/>
-          <w:bCs/>
-        </w:rPr>
-        <w:t>Textise</w:t>
-      </w:r>
-      <w:proofErr w:type="spellEnd"/>
-      <w:r>
-        <w:rPr>
-          <w:b/>
-          <w:bCs/>
-        </w:rPr>
-        <w:t xml:space="preserve"> / accesibilidad textual)</w:t>
+        <w:t xml:space="preserve">, pero se echa en falta descripciones alternativas (atributos alt) y etiquetas ARIA que ofrezcan equivalentes textuales a los recursos visuales y a la interacción. Para usuarios que dependen solo de texto (lectores de pantalla), es esencial que </w:t>
+      </w:r>
+      <w:r>
+        <w:rPr>
+          <w:b/>
+          <w:bCs/>
+        </w:rPr>
+        <w:t>todas las imágenes importantes tengan alt significativos</w:t>
+      </w:r>
+      <w:r>
+        <w:t>, que los botones tengan aria-label cuando su texto sea insuficiente y que los elementos dinámicos anuncien cambios vía ARIA live regions.</w:t>
+      </w:r>
+    </w:p>
+    <w:p>
+      <w:pPr>
+        <w:rPr>
+          <w:b/>
+          <w:bCs/>
+        </w:rPr>
+      </w:pPr>
+      <w:r>
+        <w:rPr>
+          <w:b/>
+          <w:bCs/>
+        </w:rPr>
+        <w:t>2.3. Propuestas de mejora (Textise / accesibilidad textual)</w:t>
       </w:r>
     </w:p>
     <w:p>
@@ -1554,15 +1419,7 @@
         </w:numPr>
       </w:pPr>
       <w:r>
-        <w:t xml:space="preserve">Asegurar </w:t>
-      </w:r>
-      <w:proofErr w:type="spellStart"/>
-      <w:r>
-        <w:t>alt</w:t>
-      </w:r>
-      <w:proofErr w:type="spellEnd"/>
-      <w:r>
-        <w:t xml:space="preserve"> en todas las imágenes que contienen información (promociones, productos).</w:t>
+        <w:t>Asegurar alt en todas las imágenes que contienen información (promociones, productos).</w:t>
       </w:r>
     </w:p>
     <w:p>
@@ -1573,23 +1430,7 @@
         </w:numPr>
       </w:pPr>
       <w:r>
-        <w:t xml:space="preserve">Para imágenes puramente decorativas usar </w:t>
-      </w:r>
-      <w:proofErr w:type="spellStart"/>
-      <w:r>
-        <w:t>alt</w:t>
-      </w:r>
-      <w:proofErr w:type="spellEnd"/>
-      <w:r>
-        <w:t>="" y role="</w:t>
-      </w:r>
-      <w:proofErr w:type="spellStart"/>
-      <w:r>
-        <w:t>presentation</w:t>
-      </w:r>
-      <w:proofErr w:type="spellEnd"/>
-      <w:r>
-        <w:t>".</w:t>
+        <w:t>Para imágenes puramente decorativas usar alt="" y role="presentation".</w:t>
       </w:r>
     </w:p>
     <w:p>
@@ -1600,15 +1441,7 @@
         </w:numPr>
       </w:pPr>
       <w:r>
-        <w:t>Añadir descripciones largas (</w:t>
-      </w:r>
-      <w:proofErr w:type="spellStart"/>
-      <w:r>
-        <w:t>longdesc</w:t>
-      </w:r>
-      <w:proofErr w:type="spellEnd"/>
-      <w:r>
-        <w:t xml:space="preserve"> o página alternativa) para banners complejos.</w:t>
+        <w:t>Añadir descripciones largas (longdesc o página alternativa) para banners complejos.</w:t>
       </w:r>
     </w:p>
     <w:p>
@@ -1619,15 +1452,7 @@
         </w:numPr>
       </w:pPr>
       <w:r>
-        <w:t>Asegurar que los menús y enlaces tienen texto visible o aria-</w:t>
-      </w:r>
-      <w:proofErr w:type="spellStart"/>
-      <w:r>
-        <w:t>label</w:t>
-      </w:r>
-      <w:proofErr w:type="spellEnd"/>
-      <w:r>
-        <w:t xml:space="preserve"> cuando se usan iconos.</w:t>
+        <w:t>Asegurar que los menús y enlaces tienen texto visible o aria-label cuando se usan iconos.</w:t>
       </w:r>
     </w:p>
     <w:p>
@@ -1638,37 +1463,13 @@
         </w:numPr>
       </w:pPr>
       <w:r>
-        <w:t xml:space="preserve">Incluir </w:t>
-      </w:r>
-      <w:proofErr w:type="spellStart"/>
-      <w:r>
-        <w:t>skip</w:t>
-      </w:r>
-      <w:proofErr w:type="spellEnd"/>
-      <w:r>
-        <w:t xml:space="preserve"> </w:t>
-      </w:r>
-      <w:proofErr w:type="spellStart"/>
-      <w:r>
-        <w:t>to</w:t>
-      </w:r>
-      <w:proofErr w:type="spellEnd"/>
-      <w:r>
-        <w:t xml:space="preserve"> </w:t>
-      </w:r>
-      <w:proofErr w:type="spellStart"/>
-      <w:r>
-        <w:t>content</w:t>
-      </w:r>
-      <w:proofErr w:type="spellEnd"/>
-      <w:r>
-        <w:t xml:space="preserve"> (enlace para saltar al contenido principal) que aparezca arriba y sea accesible desde teclado.</w:t>
+        <w:t>Incluir skip to content (enlace para saltar al contenido principal) que aparezca arriba y sea accesible desde teclado.</w:t>
       </w:r>
     </w:p>
     <w:p>
       <w:r>
         <w:pict w14:anchorId="69F28319">
-          <v:rect id="_x0000_i1038" style="width:0;height:1.5pt" o:hralign="center" o:hrstd="t" o:hr="t" fillcolor="#a0a0a0" stroked="f"/>
+          <v:rect id="_x0000_i1026" style="width:0;height:1.5pt" o:hralign="center" o:hrstd="t" o:hr="t" fillcolor="#a0a0a0" stroked="f"/>
         </w:pict>
       </w:r>
     </w:p>
@@ -1684,33 +1485,8 @@
           <w:b/>
           <w:bCs/>
         </w:rPr>
-        <w:t xml:space="preserve">TAREA 3 — Análisis con </w:t>
-      </w:r>
-      <w:proofErr w:type="spellStart"/>
-      <w:r>
-        <w:rPr>
-          <w:b/>
-          <w:bCs/>
-        </w:rPr>
-        <w:t>Accessibility</w:t>
-      </w:r>
-      <w:proofErr w:type="spellEnd"/>
-      <w:r>
-        <w:rPr>
-          <w:b/>
-          <w:bCs/>
-        </w:rPr>
-        <w:t xml:space="preserve"> </w:t>
-      </w:r>
-      <w:proofErr w:type="spellStart"/>
-      <w:r>
-        <w:rPr>
-          <w:b/>
-          <w:bCs/>
-        </w:rPr>
-        <w:t>Checker</w:t>
-      </w:r>
-      <w:proofErr w:type="spellEnd"/>
+        <w:t>TAREA 3 — Análisis con Accessibility Checker</w:t>
+      </w:r>
     </w:p>
     <w:p>
       <w:pPr>
@@ -1735,31 +1511,7 @@
         </w:numPr>
       </w:pPr>
       <w:r>
-        <w:t xml:space="preserve">https://www.accessibilitychecker.org/ (u otra herramienta online similar: WAVE, </w:t>
-      </w:r>
-      <w:proofErr w:type="spellStart"/>
-      <w:r>
-        <w:t>Axe</w:t>
-      </w:r>
-      <w:proofErr w:type="spellEnd"/>
-      <w:r>
-        <w:t xml:space="preserve"> </w:t>
-      </w:r>
-      <w:proofErr w:type="spellStart"/>
-      <w:r>
-        <w:t>DevTools</w:t>
-      </w:r>
-      <w:proofErr w:type="spellEnd"/>
-      <w:r>
-        <w:t xml:space="preserve">, </w:t>
-      </w:r>
-      <w:proofErr w:type="spellStart"/>
-      <w:r>
-        <w:t>Lighthouse</w:t>
-      </w:r>
-      <w:proofErr w:type="spellEnd"/>
-      <w:r>
-        <w:t>).</w:t>
+        <w:t>https://www.accessibilitychecker.org/ (u otra herramienta online similar: WAVE, Axe DevTools, Lighthouse).</w:t>
       </w:r>
     </w:p>
     <w:p>
@@ -1770,136 +1522,74 @@
         </w:numPr>
       </w:pPr>
       <w:r>
+        <w:t>Accede a la URL y ejecuta el análisis. (Adjuntar capturas de pantalla del informe).</w:t>
+      </w:r>
+    </w:p>
+    <w:p>
+      <w:r>
+        <w:rPr>
+          <w:b/>
+          <w:bCs/>
+        </w:rPr>
+        <w:t>Capturas a incluir:</w:t>
+      </w:r>
+    </w:p>
+    <w:p>
+      <w:pPr>
+        <w:numPr>
+          <w:ilvl w:val="0"/>
+          <w:numId w:val="12"/>
+        </w:numPr>
+      </w:pPr>
+      <w:r>
+        <w:t>Captura de la pantalla con los resultados generales del checker (errores / advertencias).</w:t>
+      </w:r>
+    </w:p>
+    <w:p>
+      <w:pPr>
+        <w:numPr>
+          <w:ilvl w:val="0"/>
+          <w:numId w:val="12"/>
+        </w:numPr>
+      </w:pPr>
+      <w:r>
+        <w:t>Captura ampliada de, al menos, 3 errores concretos (ej.: imágenes sin alt, formularios sin label, contrastes insuficientes).</w:t>
+      </w:r>
+    </w:p>
+    <w:p>
+      <w:pPr>
+        <w:rPr>
+          <w:b/>
+          <w:bCs/>
+        </w:rPr>
+      </w:pPr>
+      <w:r>
+        <w:rPr>
+          <w:b/>
+          <w:bCs/>
+        </w:rPr>
+        <w:t>3.2. Errores típicos esperados (en Starbucks) y explicación</w:t>
+      </w:r>
+    </w:p>
+    <w:p>
+      <w:r>
+        <w:t>A continuación, se describen errores típicos que estas herramientas suelen detectar y por qué afectan la accesibilidad, más la técnica sugerida de corrección.</w:t>
+      </w:r>
+    </w:p>
+    <w:p>
+      <w:pPr>
+        <w:numPr>
+          <w:ilvl w:val="0"/>
+          <w:numId w:val="13"/>
+        </w:numPr>
+      </w:pPr>
+      <w:r>
+        <w:rPr>
+          <w:b/>
+          <w:bCs/>
+        </w:rPr>
         <w:lastRenderedPageBreak/>
-        <w:t>Accede a la URL y ejecuta el análisis. (Adjuntar capturas de pantalla del informe).</w:t>
-      </w:r>
-    </w:p>
-    <w:p>
-      <w:r>
-        <w:rPr>
-          <w:b/>
-          <w:bCs/>
-        </w:rPr>
-        <w:t>Capturas a incluir:</w:t>
-      </w:r>
-    </w:p>
-    <w:p>
-      <w:pPr>
-        <w:numPr>
-          <w:ilvl w:val="0"/>
-          <w:numId w:val="12"/>
-        </w:numPr>
-      </w:pPr>
-      <w:r>
-        <w:t xml:space="preserve">Captura de la pantalla con los resultados generales del </w:t>
-      </w:r>
-      <w:proofErr w:type="spellStart"/>
-      <w:r>
-        <w:t>checker</w:t>
-      </w:r>
-      <w:proofErr w:type="spellEnd"/>
-      <w:r>
-        <w:t xml:space="preserve"> (errores / advertencias).</w:t>
-      </w:r>
-    </w:p>
-    <w:p>
-      <w:pPr>
-        <w:numPr>
-          <w:ilvl w:val="0"/>
-          <w:numId w:val="12"/>
-        </w:numPr>
-      </w:pPr>
-      <w:r>
-        <w:t xml:space="preserve">Captura ampliada de, al menos, 3 errores concretos (ej.: imágenes sin </w:t>
-      </w:r>
-      <w:proofErr w:type="spellStart"/>
-      <w:r>
-        <w:t>alt</w:t>
-      </w:r>
-      <w:proofErr w:type="spellEnd"/>
-      <w:r>
-        <w:t xml:space="preserve">, formularios sin </w:t>
-      </w:r>
-      <w:proofErr w:type="spellStart"/>
-      <w:r>
-        <w:t>label</w:t>
-      </w:r>
-      <w:proofErr w:type="spellEnd"/>
-      <w:r>
-        <w:t>, contrastes insuficientes).</w:t>
-      </w:r>
-    </w:p>
-    <w:p>
-      <w:pPr>
-        <w:rPr>
-          <w:b/>
-          <w:bCs/>
-        </w:rPr>
-      </w:pPr>
-      <w:r>
-        <w:rPr>
-          <w:b/>
-          <w:bCs/>
-        </w:rPr>
-        <w:t>3.2. Errores típicos esperados (en Starbucks) y explicación</w:t>
-      </w:r>
-    </w:p>
-    <w:p>
-      <w:r>
-        <w:t xml:space="preserve">A </w:t>
-      </w:r>
-      <w:r>
-        <w:t>continuación,</w:t>
-      </w:r>
-      <w:r>
-        <w:t xml:space="preserve"> se describen errores típicos que estas herramientas suelen detectar y por qué afectan la accesibilidad, más la técnica sugerida de corrección.</w:t>
-      </w:r>
-    </w:p>
-    <w:p>
-      <w:pPr>
-        <w:numPr>
-          <w:ilvl w:val="0"/>
-          <w:numId w:val="13"/>
-        </w:numPr>
-      </w:pPr>
-      <w:r>
-        <w:rPr>
-          <w:b/>
-          <w:bCs/>
-        </w:rPr>
-        <w:t xml:space="preserve">Imágenes sin atributo </w:t>
-      </w:r>
-      <w:proofErr w:type="spellStart"/>
-      <w:r>
-        <w:rPr>
-          <w:b/>
-          <w:bCs/>
-        </w:rPr>
-        <w:t>alt</w:t>
-      </w:r>
-      <w:proofErr w:type="spellEnd"/>
-      <w:r>
-        <w:rPr>
-          <w:b/>
-          <w:bCs/>
-        </w:rPr>
-        <w:t xml:space="preserve"> o </w:t>
-      </w:r>
-      <w:proofErr w:type="spellStart"/>
-      <w:r>
-        <w:rPr>
-          <w:b/>
-          <w:bCs/>
-        </w:rPr>
-        <w:t>alt</w:t>
-      </w:r>
-      <w:proofErr w:type="spellEnd"/>
-      <w:r>
-        <w:rPr>
-          <w:b/>
-          <w:bCs/>
-        </w:rPr>
-        <w:t xml:space="preserve"> vacío cuando deben describir información</w:t>
+        <w:t>Imágenes sin atributo alt o alt vacío cuando deben describir información</w:t>
       </w:r>
     </w:p>
     <w:p>
@@ -1935,31 +1625,7 @@
         <w:t>Corrección:</w:t>
       </w:r>
       <w:r>
-        <w:t xml:space="preserve"> Añadir </w:t>
-      </w:r>
-      <w:proofErr w:type="spellStart"/>
-      <w:r>
-        <w:t>alt</w:t>
-      </w:r>
-      <w:proofErr w:type="spellEnd"/>
-      <w:r>
-        <w:t xml:space="preserve">="Descripción breve y útil"; si es decorativa </w:t>
-      </w:r>
-      <w:proofErr w:type="spellStart"/>
-      <w:r>
-        <w:t>alt</w:t>
-      </w:r>
-      <w:proofErr w:type="spellEnd"/>
-      <w:r>
-        <w:t>="" + role="</w:t>
-      </w:r>
-      <w:proofErr w:type="spellStart"/>
-      <w:r>
-        <w:t>presentation</w:t>
-      </w:r>
-      <w:proofErr w:type="spellEnd"/>
-      <w:r>
-        <w:t>".</w:t>
+        <w:t xml:space="preserve"> Añadir alt="Descripción breve y útil"; si es decorativa alt="" + role="presentation".</w:t>
       </w:r>
     </w:p>
     <w:p>
@@ -2025,49 +1691,8 @@
           <w:b/>
           <w:bCs/>
         </w:rPr>
-        <w:t xml:space="preserve">Formularios sin </w:t>
-      </w:r>
-      <w:proofErr w:type="spellStart"/>
-      <w:r>
-        <w:rPr>
-          <w:b/>
-          <w:bCs/>
-        </w:rPr>
-        <w:t>label</w:t>
-      </w:r>
-      <w:proofErr w:type="spellEnd"/>
-      <w:r>
-        <w:rPr>
-          <w:b/>
-          <w:bCs/>
-        </w:rPr>
-        <w:t xml:space="preserve"> asociado o con </w:t>
-      </w:r>
-      <w:proofErr w:type="spellStart"/>
-      <w:r>
-        <w:rPr>
-          <w:b/>
-          <w:bCs/>
-        </w:rPr>
-        <w:t>placeholder</w:t>
-      </w:r>
-      <w:proofErr w:type="spellEnd"/>
-      <w:r>
-        <w:rPr>
-          <w:b/>
-          <w:bCs/>
-        </w:rPr>
-        <w:t xml:space="preserve"> usado como </w:t>
-      </w:r>
-      <w:proofErr w:type="spellStart"/>
-      <w:r>
-        <w:rPr>
-          <w:b/>
-          <w:bCs/>
-        </w:rPr>
-        <w:t>label</w:t>
-      </w:r>
-      <w:proofErr w:type="spellEnd"/>
+        <w:t>Formularios sin label asociado o con placeholder usado como label</w:t>
+      </w:r>
     </w:p>
     <w:p>
       <w:pPr>
@@ -2102,39 +1727,7 @@
         <w:t>Corrección:</w:t>
       </w:r>
       <w:r>
-        <w:t xml:space="preserve"> Añadir </w:t>
-      </w:r>
-      <w:proofErr w:type="spellStart"/>
-      <w:r>
-        <w:t>label</w:t>
-      </w:r>
-      <w:proofErr w:type="spellEnd"/>
-      <w:r>
-        <w:t xml:space="preserve"> </w:t>
-      </w:r>
-      <w:proofErr w:type="spellStart"/>
-      <w:r>
-        <w:t>for</w:t>
-      </w:r>
-      <w:proofErr w:type="spellEnd"/>
-      <w:r>
-        <w:t xml:space="preserve">="id" y mantener </w:t>
-      </w:r>
-      <w:proofErr w:type="spellStart"/>
-      <w:r>
-        <w:t>placeholder</w:t>
-      </w:r>
-      <w:proofErr w:type="spellEnd"/>
-      <w:r>
-        <w:t xml:space="preserve"> solo como ayuda; usar aria-</w:t>
-      </w:r>
-      <w:proofErr w:type="spellStart"/>
-      <w:r>
-        <w:t>required</w:t>
-      </w:r>
-      <w:proofErr w:type="spellEnd"/>
-      <w:r>
-        <w:t xml:space="preserve"> si es obligatorio.</w:t>
+        <w:t xml:space="preserve"> Añadir label for="id" y mantener placeholder solo como ayuda; usar aria-required si es obligatorio.</w:t>
       </w:r>
     </w:p>
     <w:p>
@@ -2149,23 +1742,7 @@
           <w:b/>
           <w:bCs/>
         </w:rPr>
-        <w:t>Enlaces con texto poco descriptivo (“Leer más”, “</w:t>
-      </w:r>
-      <w:proofErr w:type="spellStart"/>
-      <w:r>
-        <w:rPr>
-          <w:b/>
-          <w:bCs/>
-        </w:rPr>
-        <w:t>Click</w:t>
-      </w:r>
-      <w:proofErr w:type="spellEnd"/>
-      <w:r>
-        <w:rPr>
-          <w:b/>
-          <w:bCs/>
-        </w:rPr>
-        <w:t xml:space="preserve"> aquí”)</w:t>
+        <w:t>Enlaces con texto poco descriptivo (“Leer más”, “Click aquí”)</w:t>
       </w:r>
     </w:p>
     <w:p>
@@ -2201,15 +1778,7 @@
         <w:t>Corrección:</w:t>
       </w:r>
       <w:r>
-        <w:t xml:space="preserve"> Usar texto descriptivo o aria-</w:t>
-      </w:r>
-      <w:proofErr w:type="spellStart"/>
-      <w:r>
-        <w:t>label</w:t>
-      </w:r>
-      <w:proofErr w:type="spellEnd"/>
-      <w:r>
-        <w:t xml:space="preserve"> que indique el destino.</w:t>
+        <w:t xml:space="preserve"> Usar texto descriptivo o aria-label que indique el destino.</w:t>
       </w:r>
     </w:p>
     <w:p>
@@ -2257,217 +1826,113 @@
           <w:b/>
           <w:bCs/>
         </w:rPr>
+        <w:t>Corrección:</w:t>
+      </w:r>
+      <w:r>
+        <w:t xml:space="preserve"> Estilizar :focus con contraste (ej. outline: 3px solid #FF6B00 o box-shadow).</w:t>
+      </w:r>
+    </w:p>
+    <w:p>
+      <w:pPr>
+        <w:numPr>
+          <w:ilvl w:val="0"/>
+          <w:numId w:val="13"/>
+        </w:numPr>
+      </w:pPr>
+      <w:r>
+        <w:rPr>
+          <w:b/>
+          <w:bCs/>
+        </w:rPr>
+        <w:t>Orden de tabulación inconsistente</w:t>
+      </w:r>
+    </w:p>
+    <w:p>
+      <w:pPr>
+        <w:numPr>
+          <w:ilvl w:val="1"/>
+          <w:numId w:val="13"/>
+        </w:numPr>
+      </w:pPr>
+      <w:r>
+        <w:rPr>
+          <w:b/>
+          <w:bCs/>
+        </w:rPr>
+        <w:t>Impacto:</w:t>
+      </w:r>
+      <w:r>
+        <w:t xml:space="preserve"> Navegación por teclado confusa.</w:t>
+      </w:r>
+    </w:p>
+    <w:p>
+      <w:pPr>
+        <w:numPr>
+          <w:ilvl w:val="1"/>
+          <w:numId w:val="13"/>
+        </w:numPr>
+      </w:pPr>
+      <w:r>
+        <w:rPr>
+          <w:b/>
+          <w:bCs/>
+        </w:rPr>
+        <w:t>Corrección:</w:t>
+      </w:r>
+      <w:r>
+        <w:t xml:space="preserve"> Asegurar DOM y orden visual coincidan; evitar tabindex positivo.</w:t>
+      </w:r>
+    </w:p>
+    <w:p>
+      <w:pPr>
+        <w:numPr>
+          <w:ilvl w:val="0"/>
+          <w:numId w:val="13"/>
+        </w:numPr>
+      </w:pPr>
+      <w:r>
+        <w:rPr>
+          <w:b/>
+          <w:bCs/>
+        </w:rPr>
+        <w:t>Elementos dinámicos (modals, live updates) sin ARIA</w:t>
+      </w:r>
+    </w:p>
+    <w:p>
+      <w:pPr>
+        <w:numPr>
+          <w:ilvl w:val="1"/>
+          <w:numId w:val="13"/>
+        </w:numPr>
+      </w:pPr>
+      <w:r>
+        <w:rPr>
+          <w:b/>
+          <w:bCs/>
+        </w:rPr>
+        <w:t>Impacto:</w:t>
+      </w:r>
+      <w:r>
+        <w:t xml:space="preserve"> Lectores de pantalla no perciben contenido nuevo.</w:t>
+      </w:r>
+    </w:p>
+    <w:p>
+      <w:pPr>
+        <w:numPr>
+          <w:ilvl w:val="1"/>
+          <w:numId w:val="13"/>
+        </w:numPr>
+      </w:pPr>
+      <w:r>
+        <w:rPr>
+          <w:b/>
+          <w:bCs/>
+        </w:rPr>
         <w:lastRenderedPageBreak/>
         <w:t>Corrección:</w:t>
       </w:r>
       <w:r>
-        <w:t xml:space="preserve"> Estilizar :</w:t>
-      </w:r>
-      <w:proofErr w:type="spellStart"/>
-      <w:r>
-        <w:t>focus</w:t>
-      </w:r>
-      <w:proofErr w:type="spellEnd"/>
-      <w:r>
-        <w:t xml:space="preserve"> con contraste (ej. </w:t>
-      </w:r>
-      <w:proofErr w:type="spellStart"/>
-      <w:r>
-        <w:t>outline</w:t>
-      </w:r>
-      <w:proofErr w:type="spellEnd"/>
-      <w:r>
-        <w:t xml:space="preserve">: 3px </w:t>
-      </w:r>
-      <w:proofErr w:type="spellStart"/>
-      <w:r>
-        <w:t>solid</w:t>
-      </w:r>
-      <w:proofErr w:type="spellEnd"/>
-      <w:r>
-        <w:t xml:space="preserve"> #FF6B00 o box-</w:t>
-      </w:r>
-      <w:proofErr w:type="spellStart"/>
-      <w:r>
-        <w:t>shadow</w:t>
-      </w:r>
-      <w:proofErr w:type="spellEnd"/>
-      <w:r>
-        <w:t>).</w:t>
-      </w:r>
-    </w:p>
-    <w:p>
-      <w:pPr>
-        <w:numPr>
-          <w:ilvl w:val="0"/>
-          <w:numId w:val="13"/>
-        </w:numPr>
-      </w:pPr>
-      <w:r>
-        <w:rPr>
-          <w:b/>
-          <w:bCs/>
-        </w:rPr>
-        <w:t>Orden de tabulación inconsistente</w:t>
-      </w:r>
-    </w:p>
-    <w:p>
-      <w:pPr>
-        <w:numPr>
-          <w:ilvl w:val="1"/>
-          <w:numId w:val="13"/>
-        </w:numPr>
-      </w:pPr>
-      <w:r>
-        <w:rPr>
-          <w:b/>
-          <w:bCs/>
-        </w:rPr>
-        <w:t>Impacto:</w:t>
-      </w:r>
-      <w:r>
-        <w:t xml:space="preserve"> Navegación por teclado confusa.</w:t>
-      </w:r>
-    </w:p>
-    <w:p>
-      <w:pPr>
-        <w:numPr>
-          <w:ilvl w:val="1"/>
-          <w:numId w:val="13"/>
-        </w:numPr>
-      </w:pPr>
-      <w:r>
-        <w:rPr>
-          <w:b/>
-          <w:bCs/>
-        </w:rPr>
-        <w:t>Corrección:</w:t>
-      </w:r>
-      <w:r>
-        <w:t xml:space="preserve"> Asegurar DOM y orden visual coincidan; evitar </w:t>
-      </w:r>
-      <w:proofErr w:type="spellStart"/>
-      <w:r>
-        <w:t>tabindex</w:t>
-      </w:r>
-      <w:proofErr w:type="spellEnd"/>
-      <w:r>
-        <w:t xml:space="preserve"> positivo.</w:t>
-      </w:r>
-    </w:p>
-    <w:p>
-      <w:pPr>
-        <w:numPr>
-          <w:ilvl w:val="0"/>
-          <w:numId w:val="13"/>
-        </w:numPr>
-      </w:pPr>
-      <w:r>
-        <w:rPr>
-          <w:b/>
-          <w:bCs/>
-        </w:rPr>
-        <w:t>Elementos dinámicos (</w:t>
-      </w:r>
-      <w:proofErr w:type="spellStart"/>
-      <w:r>
-        <w:rPr>
-          <w:b/>
-          <w:bCs/>
-        </w:rPr>
-        <w:t>modals</w:t>
-      </w:r>
-      <w:proofErr w:type="spellEnd"/>
-      <w:r>
-        <w:rPr>
-          <w:b/>
-          <w:bCs/>
-        </w:rPr>
-        <w:t xml:space="preserve">, </w:t>
-      </w:r>
-      <w:proofErr w:type="spellStart"/>
-      <w:r>
-        <w:rPr>
-          <w:b/>
-          <w:bCs/>
-        </w:rPr>
-        <w:t>live</w:t>
-      </w:r>
-      <w:proofErr w:type="spellEnd"/>
-      <w:r>
-        <w:rPr>
-          <w:b/>
-          <w:bCs/>
-        </w:rPr>
-        <w:t xml:space="preserve"> </w:t>
-      </w:r>
-      <w:proofErr w:type="spellStart"/>
-      <w:r>
-        <w:rPr>
-          <w:b/>
-          <w:bCs/>
-        </w:rPr>
-        <w:t>updates</w:t>
-      </w:r>
-      <w:proofErr w:type="spellEnd"/>
-      <w:r>
-        <w:rPr>
-          <w:b/>
-          <w:bCs/>
-        </w:rPr>
-        <w:t>) sin ARIA</w:t>
-      </w:r>
-    </w:p>
-    <w:p>
-      <w:pPr>
-        <w:numPr>
-          <w:ilvl w:val="1"/>
-          <w:numId w:val="13"/>
-        </w:numPr>
-      </w:pPr>
-      <w:r>
-        <w:rPr>
-          <w:b/>
-          <w:bCs/>
-        </w:rPr>
-        <w:t>Impacto:</w:t>
-      </w:r>
-      <w:r>
-        <w:t xml:space="preserve"> Lectores de pantalla no perciben contenido nuevo.</w:t>
-      </w:r>
-    </w:p>
-    <w:p>
-      <w:pPr>
-        <w:numPr>
-          <w:ilvl w:val="1"/>
-          <w:numId w:val="13"/>
-        </w:numPr>
-      </w:pPr>
-      <w:r>
-        <w:rPr>
-          <w:b/>
-          <w:bCs/>
-        </w:rPr>
-        <w:t>Corrección:</w:t>
-      </w:r>
-      <w:r>
-        <w:t xml:space="preserve"> Usar aria-</w:t>
-      </w:r>
-      <w:proofErr w:type="spellStart"/>
-      <w:r>
-        <w:t>live</w:t>
-      </w:r>
-      <w:proofErr w:type="spellEnd"/>
-      <w:r>
-        <w:t>, role="</w:t>
-      </w:r>
-      <w:proofErr w:type="spellStart"/>
-      <w:r>
-        <w:t>dialog</w:t>
-      </w:r>
-      <w:proofErr w:type="spellEnd"/>
-      <w:r>
-        <w:t>", aria-modal="true", y gestionar foco al abrir/cerrar.</w:t>
+        <w:t xml:space="preserve"> Usar aria-live, role="dialog", aria-modal="true", y gestionar foco al abrir/cerrar.</w:t>
       </w:r>
     </w:p>
     <w:p>
@@ -2497,34 +1962,10 @@
           <w:b/>
           <w:bCs/>
         </w:rPr>
-        <w:t xml:space="preserve">Imagen sin </w:t>
-      </w:r>
-      <w:proofErr w:type="spellStart"/>
-      <w:r>
-        <w:rPr>
-          <w:b/>
-          <w:bCs/>
-        </w:rPr>
-        <w:t>alt</w:t>
-      </w:r>
-      <w:proofErr w:type="spellEnd"/>
-      <w:r>
-        <w:rPr>
-          <w:b/>
-          <w:bCs/>
-        </w:rPr>
-        <w:t>:</w:t>
-      </w:r>
-      <w:r>
-        <w:t xml:space="preserve"> revisar CMS o plantillas y forzar campos </w:t>
-      </w:r>
-      <w:proofErr w:type="spellStart"/>
-      <w:r>
-        <w:t>alt</w:t>
-      </w:r>
-      <w:proofErr w:type="spellEnd"/>
-      <w:r>
-        <w:t xml:space="preserve"> obligatorios al subir imágenes.</w:t>
+        <w:t>Imagen sin alt:</w:t>
+      </w:r>
+      <w:r>
+        <w:t xml:space="preserve"> revisar CMS o plantillas y forzar campos alt obligatorios al subir imágenes.</w:t>
       </w:r>
     </w:p>
     <w:p>
@@ -2542,15 +1983,7 @@
         <w:t>Contraste insuficiente:</w:t>
       </w:r>
       <w:r>
-        <w:t xml:space="preserve"> sustituir color, o añadir borde/</w:t>
-      </w:r>
-      <w:proofErr w:type="spellStart"/>
-      <w:r>
-        <w:t>outline</w:t>
-      </w:r>
-      <w:proofErr w:type="spellEnd"/>
-      <w:r>
-        <w:t xml:space="preserve"> y aumentar peso de fuente.</w:t>
+        <w:t xml:space="preserve"> sustituir color, o añadir borde/outline y aumentar peso de fuente.</w:t>
       </w:r>
     </w:p>
     <w:p>
@@ -2568,31 +2001,7 @@
         <w:t>Formularios:</w:t>
       </w:r>
       <w:r>
-        <w:t xml:space="preserve"> asociar </w:t>
-      </w:r>
-      <w:proofErr w:type="spellStart"/>
-      <w:r>
-        <w:t>label</w:t>
-      </w:r>
-      <w:proofErr w:type="spellEnd"/>
-      <w:r>
-        <w:t xml:space="preserve"> con </w:t>
-      </w:r>
-      <w:proofErr w:type="spellStart"/>
-      <w:r>
-        <w:t>for</w:t>
-      </w:r>
-      <w:proofErr w:type="spellEnd"/>
-      <w:r>
-        <w:t>, añadir aria-</w:t>
-      </w:r>
-      <w:proofErr w:type="spellStart"/>
-      <w:r>
-        <w:t>describedby</w:t>
-      </w:r>
-      <w:proofErr w:type="spellEnd"/>
-      <w:r>
-        <w:t xml:space="preserve"> para mensajes de ayuda.</w:t>
+        <w:t xml:space="preserve"> asociar label con for, añadir aria-describedby para mensajes de ayuda.</w:t>
       </w:r>
     </w:p>
     <w:p>
@@ -2610,15 +2019,7 @@
         <w:t>Enlaces:</w:t>
       </w:r>
       <w:r>
-        <w:t xml:space="preserve"> reescribir textos a “Ver ficha del producto: X” o aria-</w:t>
-      </w:r>
-      <w:proofErr w:type="spellStart"/>
-      <w:r>
-        <w:t>label</w:t>
-      </w:r>
-      <w:proofErr w:type="spellEnd"/>
-      <w:r>
-        <w:t>="Ver ficha X".</w:t>
+        <w:t xml:space="preserve"> reescribir textos a “Ver ficha del producto: X” o aria-label="Ver ficha X".</w:t>
       </w:r>
     </w:p>
     <w:p>
@@ -2654,28 +2055,12 @@
         <w:t>Orden de tabulación:</w:t>
       </w:r>
       <w:r>
-        <w:t xml:space="preserve"> test manual con </w:t>
-      </w:r>
-      <w:proofErr w:type="spellStart"/>
-      <w:r>
-        <w:t>Tab</w:t>
-      </w:r>
-      <w:proofErr w:type="spellEnd"/>
-      <w:r>
-        <w:t xml:space="preserve"> / </w:t>
-      </w:r>
-      <w:proofErr w:type="spellStart"/>
-      <w:r>
-        <w:t>Shift+Tab</w:t>
-      </w:r>
-      <w:proofErr w:type="spellEnd"/>
-      <w:r>
-        <w:t xml:space="preserve"> y corregir HTML (evitar position absolute que mueva foco fuera de flujo).</w:t>
+        <w:t xml:space="preserve"> test manual con Tab / Shift+Tab y corregir HTML (evitar position absolute que mueva foco fuera de flujo).</w:t>
       </w:r>
     </w:p>
     <w:p/>
     <w:sectPr>
-      <w:headerReference w:type="default" r:id="rId7"/>
+      <w:headerReference w:type="default" r:id="rId12"/>
       <w:pgSz w:w="11906" w:h="16838"/>
       <w:pgMar w:top="1417" w:right="1701" w:bottom="1417" w:left="1701" w:header="708" w:footer="708" w:gutter="0"/>
       <w:cols w:space="708"/>
@@ -5396,6 +4781,7 @@
   <w:style w:type="character" w:default="1" w:styleId="Fuentedeprrafopredeter">
     <w:name w:val="Default Paragraph Font"/>
     <w:uiPriority w:val="1"/>
+    <w:semiHidden/>
     <w:unhideWhenUsed/>
   </w:style>
   <w:style w:type="table" w:default="1" w:styleId="Tablanormal">

</xml_diff>